<commit_message>
chỉnh lại câu a docx
</commit_message>
<xml_diff>
--- a/doc/03-LeTrangQuangThanh.docx
+++ b/doc/03-LeTrangQuangThanh.docx
@@ -81,19 +81,27 @@
           <w:szCs w:val="26"/>
         </w:rPr>
       </w:pPr>
-      <w:proofErr w:type="spellStart"/>
-      <w:r>
-        <w:rPr>
-          <w:rFonts w:ascii="Times New Roman" w:hAnsi="Times New Roman" w:cs="Times New Roman"/>
-          <w:sz w:val="26"/>
-          <w:szCs w:val="26"/>
-        </w:rPr>
-        <w:t>Nhóm</w:t>
-      </w:r>
-      <w:proofErr w:type="spellEnd"/>
-      <w:r>
-        <w:rPr>
-          <w:rFonts w:ascii="Times New Roman" w:hAnsi="Times New Roman" w:cs="Times New Roman"/>
+      <w:r>
+        <w:rPr>
+          <w:rFonts w:ascii="Times New Roman" w:hAnsi="Times New Roman" w:cs="Times New Roman"/>
+          <w:sz w:val="26"/>
+          <w:szCs w:val="26"/>
+        </w:rPr>
+        <w:t xml:space="preserve">Nhóm </w:t>
+      </w:r>
+      <w:r>
+        <w:rPr>
+          <w:rFonts w:ascii="Times New Roman" w:hAnsi="Times New Roman" w:cs="Times New Roman"/>
+          <w:color w:val="000000" w:themeColor="text1"/>
+          <w:sz w:val="26"/>
+          <w:szCs w:val="26"/>
+        </w:rPr>
+        <w:t>04</w:t>
+      </w:r>
+      <w:r>
+        <w:rPr>
+          <w:rFonts w:ascii="Times New Roman" w:hAnsi="Times New Roman" w:cs="Times New Roman"/>
+          <w:color w:val="FF0000"/>
           <w:sz w:val="26"/>
           <w:szCs w:val="26"/>
         </w:rPr>
@@ -102,24 +110,6 @@
       <w:r>
         <w:rPr>
           <w:rFonts w:ascii="Times New Roman" w:hAnsi="Times New Roman" w:cs="Times New Roman"/>
-          <w:color w:val="000000" w:themeColor="text1"/>
-          <w:sz w:val="26"/>
-          <w:szCs w:val="26"/>
-        </w:rPr>
-        <w:t>04</w:t>
-      </w:r>
-      <w:r>
-        <w:rPr>
-          <w:rFonts w:ascii="Times New Roman" w:hAnsi="Times New Roman" w:cs="Times New Roman"/>
-          <w:color w:val="FF0000"/>
-          <w:sz w:val="26"/>
-          <w:szCs w:val="26"/>
-        </w:rPr>
-        <w:t xml:space="preserve"> </w:t>
-      </w:r>
-      <w:r>
-        <w:rPr>
-          <w:rFonts w:ascii="Times New Roman" w:hAnsi="Times New Roman" w:cs="Times New Roman"/>
           <w:sz w:val="26"/>
           <w:szCs w:val="26"/>
         </w:rPr>
@@ -131,37 +121,8 @@
           <w:sz w:val="26"/>
           <w:szCs w:val="26"/>
         </w:rPr>
-        <w:t xml:space="preserve">Thành </w:t>
-      </w:r>
-      <w:proofErr w:type="spellStart"/>
-      <w:r>
-        <w:rPr>
-          <w:rFonts w:ascii="Times New Roman" w:hAnsi="Times New Roman" w:cs="Times New Roman"/>
-          <w:sz w:val="26"/>
-          <w:szCs w:val="26"/>
-        </w:rPr>
-        <w:t>viên</w:t>
-      </w:r>
-      <w:proofErr w:type="spellEnd"/>
-      <w:r>
-        <w:rPr>
-          <w:rFonts w:ascii="Times New Roman" w:hAnsi="Times New Roman" w:cs="Times New Roman"/>
-          <w:sz w:val="26"/>
-          <w:szCs w:val="26"/>
-        </w:rPr>
-        <w:t xml:space="preserve"> </w:t>
-      </w:r>
-      <w:proofErr w:type="spellStart"/>
-      <w:proofErr w:type="gramStart"/>
-      <w:r>
-        <w:rPr>
-          <w:rFonts w:ascii="Times New Roman" w:hAnsi="Times New Roman" w:cs="Times New Roman"/>
-          <w:sz w:val="26"/>
-          <w:szCs w:val="26"/>
-        </w:rPr>
-        <w:t>nhóm</w:t>
-      </w:r>
-      <w:proofErr w:type="spellEnd"/>
+        <w:t>Thành viên nhóm</w:t>
+      </w:r>
       <w:r>
         <w:rPr>
           <w:rFonts w:ascii="Times New Roman" w:hAnsi="Times New Roman" w:cs="Times New Roman"/>
@@ -170,7 +131,6 @@
         </w:rPr>
         <w:t xml:space="preserve"> :</w:t>
       </w:r>
-      <w:proofErr w:type="gramEnd"/>
     </w:p>
     <w:p>
       <w:pPr>
@@ -276,47 +236,7 @@
                 <w:sz w:val="26"/>
                 <w:szCs w:val="26"/>
               </w:rPr>
-              <w:t>Lê Trần Quang Thanh (</w:t>
-            </w:r>
-            <w:proofErr w:type="spellStart"/>
-            <w:r>
-              <w:rPr>
-                <w:rFonts w:ascii="Times New Roman" w:hAnsi="Times New Roman" w:cs="Times New Roman"/>
-                <w:color w:val="000000" w:themeColor="text1"/>
-                <w:sz w:val="26"/>
-                <w:szCs w:val="26"/>
-              </w:rPr>
-              <w:t>Nhóm</w:t>
-            </w:r>
-            <w:proofErr w:type="spellEnd"/>
-            <w:r>
-              <w:rPr>
-                <w:rFonts w:ascii="Times New Roman" w:hAnsi="Times New Roman" w:cs="Times New Roman"/>
-                <w:color w:val="000000" w:themeColor="text1"/>
-                <w:sz w:val="26"/>
-                <w:szCs w:val="26"/>
-              </w:rPr>
-              <w:t xml:space="preserve"> </w:t>
-            </w:r>
-            <w:proofErr w:type="spellStart"/>
-            <w:r>
-              <w:rPr>
-                <w:rFonts w:ascii="Times New Roman" w:hAnsi="Times New Roman" w:cs="Times New Roman"/>
-                <w:color w:val="000000" w:themeColor="text1"/>
-                <w:sz w:val="26"/>
-                <w:szCs w:val="26"/>
-              </w:rPr>
-              <w:t>trưởng</w:t>
-            </w:r>
-            <w:proofErr w:type="spellEnd"/>
-            <w:r>
-              <w:rPr>
-                <w:rFonts w:ascii="Times New Roman" w:hAnsi="Times New Roman" w:cs="Times New Roman"/>
-                <w:color w:val="000000" w:themeColor="text1"/>
-                <w:sz w:val="26"/>
-                <w:szCs w:val="26"/>
-              </w:rPr>
-              <w:t>)</w:t>
+              <w:t>Lê Trần Quang Thanh (Nhóm trưởng)</w:t>
             </w:r>
           </w:p>
         </w:tc>
@@ -475,27 +395,7 @@
                 <w:sz w:val="26"/>
                 <w:szCs w:val="26"/>
               </w:rPr>
-              <w:t xml:space="preserve">Nguyễn </w:t>
-            </w:r>
-            <w:proofErr w:type="spellStart"/>
-            <w:r>
-              <w:rPr>
-                <w:rFonts w:ascii="Times New Roman" w:hAnsi="Times New Roman" w:cs="Times New Roman"/>
-                <w:color w:val="000000" w:themeColor="text1"/>
-                <w:sz w:val="26"/>
-                <w:szCs w:val="26"/>
-              </w:rPr>
-              <w:t>Khắc</w:t>
-            </w:r>
-            <w:proofErr w:type="spellEnd"/>
-            <w:r>
-              <w:rPr>
-                <w:rFonts w:ascii="Times New Roman" w:hAnsi="Times New Roman" w:cs="Times New Roman"/>
-                <w:color w:val="000000" w:themeColor="text1"/>
-                <w:sz w:val="26"/>
-                <w:szCs w:val="26"/>
-              </w:rPr>
-              <w:t xml:space="preserve"> Duy</w:t>
+              <w:t>Nguyễn Khắc Duy</w:t>
             </w:r>
           </w:p>
         </w:tc>
@@ -541,7 +441,6 @@
                 <w:szCs w:val="26"/>
               </w:rPr>
             </w:pPr>
-            <w:proofErr w:type="spellStart"/>
             <w:r>
               <w:rPr>
                 <w:rFonts w:ascii="Times New Roman" w:hAnsi="Times New Roman" w:cs="Times New Roman"/>
@@ -549,17 +448,7 @@
                 <w:sz w:val="26"/>
                 <w:szCs w:val="26"/>
               </w:rPr>
-              <w:t>Hồ</w:t>
-            </w:r>
-            <w:proofErr w:type="spellEnd"/>
-            <w:r>
-              <w:rPr>
-                <w:rFonts w:ascii="Times New Roman" w:hAnsi="Times New Roman" w:cs="Times New Roman"/>
-                <w:color w:val="000000" w:themeColor="text1"/>
-                <w:sz w:val="26"/>
-                <w:szCs w:val="26"/>
-              </w:rPr>
-              <w:t xml:space="preserve"> Văn Khánh</w:t>
+              <w:t>Hồ Văn Khánh</w:t>
             </w:r>
           </w:p>
         </w:tc>
@@ -615,7 +504,6 @@
           <w:szCs w:val="26"/>
         </w:rPr>
       </w:pPr>
-      <w:proofErr w:type="spellStart"/>
       <w:r>
         <w:rPr>
           <w:rFonts w:ascii="Times New Roman" w:hAnsi="Times New Roman" w:cs="Times New Roman"/>
@@ -623,57 +511,7 @@
           <w:sz w:val="26"/>
           <w:szCs w:val="26"/>
         </w:rPr>
-        <w:t>Tên</w:t>
-      </w:r>
-      <w:proofErr w:type="spellEnd"/>
-      <w:r>
-        <w:rPr>
-          <w:rFonts w:ascii="Times New Roman" w:hAnsi="Times New Roman" w:cs="Times New Roman"/>
-          <w:i/>
-          <w:sz w:val="26"/>
-          <w:szCs w:val="26"/>
-        </w:rPr>
-        <w:t xml:space="preserve"> </w:t>
-      </w:r>
-      <w:proofErr w:type="spellStart"/>
-      <w:r>
-        <w:rPr>
-          <w:rFonts w:ascii="Times New Roman" w:hAnsi="Times New Roman" w:cs="Times New Roman"/>
-          <w:i/>
-          <w:sz w:val="26"/>
-          <w:szCs w:val="26"/>
-        </w:rPr>
-        <w:t>ứng</w:t>
-      </w:r>
-      <w:proofErr w:type="spellEnd"/>
-      <w:r>
-        <w:rPr>
-          <w:rFonts w:ascii="Times New Roman" w:hAnsi="Times New Roman" w:cs="Times New Roman"/>
-          <w:i/>
-          <w:sz w:val="26"/>
-          <w:szCs w:val="26"/>
-        </w:rPr>
-        <w:t xml:space="preserve"> </w:t>
-      </w:r>
-      <w:proofErr w:type="spellStart"/>
-      <w:r>
-        <w:rPr>
-          <w:rFonts w:ascii="Times New Roman" w:hAnsi="Times New Roman" w:cs="Times New Roman"/>
-          <w:i/>
-          <w:sz w:val="26"/>
-          <w:szCs w:val="26"/>
-        </w:rPr>
-        <w:t>dụng</w:t>
-      </w:r>
-      <w:proofErr w:type="spellEnd"/>
-      <w:r>
-        <w:rPr>
-          <w:rFonts w:ascii="Times New Roman" w:hAnsi="Times New Roman" w:cs="Times New Roman"/>
-          <w:i/>
-          <w:sz w:val="26"/>
-          <w:szCs w:val="26"/>
-        </w:rPr>
-        <w:t>:</w:t>
+        <w:t>Tên ứng dụng:</w:t>
       </w:r>
       <w:r>
         <w:rPr>
@@ -717,16 +555,14 @@
           <w:szCs w:val="26"/>
         </w:rPr>
       </w:pPr>
-      <w:proofErr w:type="spellStart"/>
-      <w:r>
-        <w:rPr>
-          <w:rFonts w:ascii="Times New Roman" w:hAnsi="Times New Roman" w:cs="Times New Roman"/>
-          <w:sz w:val="26"/>
-          <w:szCs w:val="26"/>
-        </w:rPr>
-        <w:t>Thời</w:t>
-      </w:r>
-      <w:proofErr w:type="spellEnd"/>
+      <w:r>
+        <w:rPr>
+          <w:rFonts w:ascii="Times New Roman" w:hAnsi="Times New Roman" w:cs="Times New Roman"/>
+          <w:sz w:val="26"/>
+          <w:szCs w:val="26"/>
+        </w:rPr>
+        <w:t>Thời gian thực hiện: Từ</w:t>
+      </w:r>
       <w:r>
         <w:rPr>
           <w:rFonts w:ascii="Times New Roman" w:hAnsi="Times New Roman" w:cs="Times New Roman"/>
@@ -735,78 +571,6 @@
         </w:rPr>
         <w:t xml:space="preserve"> </w:t>
       </w:r>
-      <w:proofErr w:type="spellStart"/>
-      <w:r>
-        <w:rPr>
-          <w:rFonts w:ascii="Times New Roman" w:hAnsi="Times New Roman" w:cs="Times New Roman"/>
-          <w:sz w:val="26"/>
-          <w:szCs w:val="26"/>
-        </w:rPr>
-        <w:t>gian</w:t>
-      </w:r>
-      <w:proofErr w:type="spellEnd"/>
-      <w:r>
-        <w:rPr>
-          <w:rFonts w:ascii="Times New Roman" w:hAnsi="Times New Roman" w:cs="Times New Roman"/>
-          <w:sz w:val="26"/>
-          <w:szCs w:val="26"/>
-        </w:rPr>
-        <w:t xml:space="preserve"> </w:t>
-      </w:r>
-      <w:proofErr w:type="spellStart"/>
-      <w:r>
-        <w:rPr>
-          <w:rFonts w:ascii="Times New Roman" w:hAnsi="Times New Roman" w:cs="Times New Roman"/>
-          <w:sz w:val="26"/>
-          <w:szCs w:val="26"/>
-        </w:rPr>
-        <w:t>thực</w:t>
-      </w:r>
-      <w:proofErr w:type="spellEnd"/>
-      <w:r>
-        <w:rPr>
-          <w:rFonts w:ascii="Times New Roman" w:hAnsi="Times New Roman" w:cs="Times New Roman"/>
-          <w:sz w:val="26"/>
-          <w:szCs w:val="26"/>
-        </w:rPr>
-        <w:t xml:space="preserve"> </w:t>
-      </w:r>
-      <w:proofErr w:type="spellStart"/>
-      <w:r>
-        <w:rPr>
-          <w:rFonts w:ascii="Times New Roman" w:hAnsi="Times New Roman" w:cs="Times New Roman"/>
-          <w:sz w:val="26"/>
-          <w:szCs w:val="26"/>
-        </w:rPr>
-        <w:t>hiện</w:t>
-      </w:r>
-      <w:proofErr w:type="spellEnd"/>
-      <w:r>
-        <w:rPr>
-          <w:rFonts w:ascii="Times New Roman" w:hAnsi="Times New Roman" w:cs="Times New Roman"/>
-          <w:sz w:val="26"/>
-          <w:szCs w:val="26"/>
-        </w:rPr>
-        <w:t xml:space="preserve">: </w:t>
-      </w:r>
-      <w:proofErr w:type="spellStart"/>
-      <w:r>
-        <w:rPr>
-          <w:rFonts w:ascii="Times New Roman" w:hAnsi="Times New Roman" w:cs="Times New Roman"/>
-          <w:sz w:val="26"/>
-          <w:szCs w:val="26"/>
-        </w:rPr>
-        <w:t>Từ</w:t>
-      </w:r>
-      <w:proofErr w:type="spellEnd"/>
-      <w:r>
-        <w:rPr>
-          <w:rFonts w:ascii="Times New Roman" w:hAnsi="Times New Roman" w:cs="Times New Roman"/>
-          <w:sz w:val="26"/>
-          <w:szCs w:val="26"/>
-        </w:rPr>
-        <w:t xml:space="preserve"> </w:t>
-      </w:r>
       <w:r>
         <w:rPr>
           <w:rFonts w:ascii="Times New Roman" w:hAnsi="Times New Roman" w:cs="Times New Roman"/>
@@ -853,25 +617,7 @@
           <w:sz w:val="26"/>
           <w:szCs w:val="26"/>
         </w:rPr>
-        <w:t xml:space="preserve"> </w:t>
-      </w:r>
-      <w:proofErr w:type="spellStart"/>
-      <w:r>
-        <w:rPr>
-          <w:rFonts w:ascii="Times New Roman" w:hAnsi="Times New Roman" w:cs="Times New Roman"/>
-          <w:sz w:val="26"/>
-          <w:szCs w:val="26"/>
-        </w:rPr>
-        <w:t>đến</w:t>
-      </w:r>
-      <w:proofErr w:type="spellEnd"/>
-      <w:r>
-        <w:rPr>
-          <w:rFonts w:ascii="Times New Roman" w:hAnsi="Times New Roman" w:cs="Times New Roman"/>
-          <w:sz w:val="26"/>
-          <w:szCs w:val="26"/>
-        </w:rPr>
-        <w:t xml:space="preserve"> </w:t>
+        <w:t xml:space="preserve"> đến </w:t>
       </w:r>
       <w:r>
         <w:rPr>
@@ -927,25 +673,7 @@
           <w:sz w:val="26"/>
           <w:szCs w:val="26"/>
         </w:rPr>
-        <w:t xml:space="preserve"> </w:t>
-      </w:r>
-      <w:proofErr w:type="spellStart"/>
-      <w:r>
-        <w:rPr>
-          <w:rFonts w:ascii="Times New Roman" w:hAnsi="Times New Roman" w:cs="Times New Roman"/>
-          <w:sz w:val="26"/>
-          <w:szCs w:val="26"/>
-        </w:rPr>
-        <w:t>tuần</w:t>
-      </w:r>
-      <w:proofErr w:type="spellEnd"/>
-      <w:r>
-        <w:rPr>
-          <w:rFonts w:ascii="Times New Roman" w:hAnsi="Times New Roman" w:cs="Times New Roman"/>
-          <w:sz w:val="26"/>
-          <w:szCs w:val="26"/>
-        </w:rPr>
-        <w:t>)</w:t>
+        <w:t xml:space="preserve"> tuần)</w:t>
       </w:r>
     </w:p>
     <w:p>
@@ -986,67 +714,16 @@
           <w:sz w:val="26"/>
           <w:szCs w:val="26"/>
         </w:rPr>
-        <w:t xml:space="preserve">Thu </w:t>
-      </w:r>
-      <w:proofErr w:type="spellStart"/>
-      <w:r>
-        <w:rPr>
-          <w:rFonts w:ascii="Times New Roman" w:hAnsi="Times New Roman" w:cs="Times New Roman"/>
-          <w:b/>
-          <w:sz w:val="26"/>
-          <w:szCs w:val="26"/>
-        </w:rPr>
-        <w:t>thập</w:t>
-      </w:r>
-      <w:proofErr w:type="spellEnd"/>
-      <w:r>
-        <w:rPr>
-          <w:rFonts w:ascii="Times New Roman" w:hAnsi="Times New Roman" w:cs="Times New Roman"/>
-          <w:b/>
-          <w:sz w:val="26"/>
-          <w:szCs w:val="26"/>
-        </w:rPr>
-        <w:t xml:space="preserve"> </w:t>
-      </w:r>
-      <w:proofErr w:type="spellStart"/>
-      <w:r>
-        <w:rPr>
-          <w:rFonts w:ascii="Times New Roman" w:hAnsi="Times New Roman" w:cs="Times New Roman"/>
-          <w:b/>
-          <w:sz w:val="26"/>
-          <w:szCs w:val="26"/>
-        </w:rPr>
-        <w:t>yêu</w:t>
-      </w:r>
-      <w:proofErr w:type="spellEnd"/>
-      <w:r>
-        <w:rPr>
-          <w:rFonts w:ascii="Times New Roman" w:hAnsi="Times New Roman" w:cs="Times New Roman"/>
-          <w:b/>
-          <w:sz w:val="26"/>
-          <w:szCs w:val="26"/>
-        </w:rPr>
-        <w:t xml:space="preserve"> </w:t>
-      </w:r>
-      <w:proofErr w:type="spellStart"/>
-      <w:r>
-        <w:rPr>
-          <w:rFonts w:ascii="Times New Roman" w:hAnsi="Times New Roman" w:cs="Times New Roman"/>
-          <w:b/>
-          <w:sz w:val="26"/>
-          <w:szCs w:val="26"/>
-        </w:rPr>
-        <w:t>cầu</w:t>
-      </w:r>
-      <w:proofErr w:type="spellEnd"/>
-      <w:r>
-        <w:rPr>
-          <w:rFonts w:ascii="Times New Roman" w:hAnsi="Times New Roman" w:cs="Times New Roman"/>
-          <w:b/>
-          <w:sz w:val="26"/>
-          <w:szCs w:val="26"/>
-        </w:rPr>
-        <w:t>:</w:t>
+        <w:t>Thu thập</w:t>
+      </w:r>
+      <w:r>
+        <w:rPr>
+          <w:rFonts w:ascii="Times New Roman" w:hAnsi="Times New Roman" w:cs="Times New Roman"/>
+          <w:b/>
+          <w:sz w:val="26"/>
+          <w:szCs w:val="26"/>
+        </w:rPr>
+        <w:t xml:space="preserve"> yêu cầu:</w:t>
       </w:r>
     </w:p>
     <w:p>
@@ -1065,77 +742,24 @@
           <w:szCs w:val="26"/>
         </w:rPr>
       </w:pPr>
-      <w:proofErr w:type="spellStart"/>
-      <w:r>
-        <w:rPr>
-          <w:rFonts w:ascii="Times New Roman" w:hAnsi="Times New Roman" w:cs="Times New Roman"/>
-          <w:b/>
-          <w:sz w:val="26"/>
-          <w:szCs w:val="26"/>
-        </w:rPr>
-        <w:t>Khảo</w:t>
-      </w:r>
-      <w:proofErr w:type="spellEnd"/>
-      <w:r>
-        <w:rPr>
-          <w:rFonts w:ascii="Times New Roman" w:hAnsi="Times New Roman" w:cs="Times New Roman"/>
-          <w:b/>
-          <w:sz w:val="26"/>
-          <w:szCs w:val="26"/>
-        </w:rPr>
-        <w:t xml:space="preserve"> </w:t>
-      </w:r>
-      <w:proofErr w:type="spellStart"/>
-      <w:r>
-        <w:rPr>
-          <w:rFonts w:ascii="Times New Roman" w:hAnsi="Times New Roman" w:cs="Times New Roman"/>
-          <w:b/>
-          <w:sz w:val="26"/>
-          <w:szCs w:val="26"/>
-        </w:rPr>
-        <w:t>sát</w:t>
-      </w:r>
-      <w:proofErr w:type="spellEnd"/>
-      <w:r>
-        <w:rPr>
-          <w:rFonts w:ascii="Times New Roman" w:hAnsi="Times New Roman" w:cs="Times New Roman"/>
-          <w:b/>
-          <w:sz w:val="26"/>
-          <w:szCs w:val="26"/>
-        </w:rPr>
-        <w:t xml:space="preserve"> </w:t>
-      </w:r>
-      <w:proofErr w:type="spellStart"/>
-      <w:r>
-        <w:rPr>
-          <w:rFonts w:ascii="Times New Roman" w:hAnsi="Times New Roman" w:cs="Times New Roman"/>
-          <w:b/>
-          <w:sz w:val="26"/>
-          <w:szCs w:val="26"/>
-        </w:rPr>
-        <w:t>hiện</w:t>
-      </w:r>
-      <w:proofErr w:type="spellEnd"/>
-      <w:r>
-        <w:rPr>
-          <w:rFonts w:ascii="Times New Roman" w:hAnsi="Times New Roman" w:cs="Times New Roman"/>
-          <w:b/>
-          <w:sz w:val="26"/>
-          <w:szCs w:val="26"/>
-        </w:rPr>
-        <w:t xml:space="preserve"> </w:t>
-      </w:r>
-      <w:proofErr w:type="spellStart"/>
-      <w:r>
-        <w:rPr>
-          <w:rFonts w:ascii="Times New Roman" w:hAnsi="Times New Roman" w:cs="Times New Roman"/>
-          <w:b/>
-          <w:sz w:val="26"/>
-          <w:szCs w:val="26"/>
-        </w:rPr>
-        <w:t>trạng</w:t>
-      </w:r>
-      <w:proofErr w:type="spellEnd"/>
+      <w:r>
+        <w:rPr>
+          <w:rFonts w:ascii="Times New Roman" w:hAnsi="Times New Roman" w:cs="Times New Roman"/>
+          <w:b/>
+          <w:sz w:val="26"/>
+          <w:szCs w:val="26"/>
+        </w:rPr>
+        <w:t>Khảo sát</w:t>
+      </w:r>
+      <w:r>
+        <w:rPr>
+          <w:rFonts w:ascii="Times New Roman" w:hAnsi="Times New Roman" w:cs="Times New Roman"/>
+          <w:b/>
+          <w:sz w:val="26"/>
+          <w:szCs w:val="26"/>
+        </w:rPr>
+        <w:t xml:space="preserve"> hiện trạng</w:t>
+      </w:r>
       <w:r>
         <w:rPr>
           <w:rFonts w:ascii="Times New Roman" w:hAnsi="Times New Roman" w:cs="Times New Roman"/>
@@ -1144,6 +768,28 @@
           <w:szCs w:val="26"/>
         </w:rPr>
         <w:t>:</w:t>
+      </w:r>
+    </w:p>
+    <w:p>
+      <w:pPr>
+        <w:pStyle w:val="ListParagraph"/>
+        <w:spacing w:after="120" w:line="240" w:lineRule="auto"/>
+        <w:jc w:val="both"/>
+        <w:rPr>
+          <w:rFonts w:ascii="Times New Roman" w:hAnsi="Times New Roman" w:cs="Times New Roman"/>
+          <w:b/>
+          <w:sz w:val="26"/>
+          <w:szCs w:val="26"/>
+        </w:rPr>
+      </w:pPr>
+      <w:r>
+        <w:rPr>
+          <w:rFonts w:ascii="Times New Roman" w:hAnsi="Times New Roman" w:cs="Times New Roman"/>
+          <w:b/>
+          <w:sz w:val="26"/>
+          <w:szCs w:val="26"/>
+        </w:rPr>
+        <w:t>…loading</w:t>
       </w:r>
     </w:p>
     <w:p>
@@ -1169,59 +815,8 @@
           <w:sz w:val="26"/>
           <w:szCs w:val="26"/>
         </w:rPr>
-        <w:t xml:space="preserve">Quy </w:t>
-      </w:r>
-      <w:proofErr w:type="spellStart"/>
-      <w:r>
-        <w:rPr>
-          <w:rFonts w:ascii="Times New Roman" w:hAnsi="Times New Roman" w:cs="Times New Roman"/>
-          <w:b/>
-          <w:sz w:val="26"/>
-          <w:szCs w:val="26"/>
-        </w:rPr>
-        <w:t>trình</w:t>
-      </w:r>
-      <w:proofErr w:type="spellEnd"/>
-      <w:r>
-        <w:rPr>
-          <w:rFonts w:ascii="Times New Roman" w:hAnsi="Times New Roman" w:cs="Times New Roman"/>
-          <w:b/>
-          <w:sz w:val="26"/>
-          <w:szCs w:val="26"/>
-        </w:rPr>
-        <w:t xml:space="preserve"> </w:t>
-      </w:r>
-      <w:proofErr w:type="spellStart"/>
-      <w:r>
-        <w:rPr>
-          <w:rFonts w:ascii="Times New Roman" w:hAnsi="Times New Roman" w:cs="Times New Roman"/>
-          <w:b/>
-          <w:sz w:val="26"/>
-          <w:szCs w:val="26"/>
-        </w:rPr>
-        <w:t>nghiệp</w:t>
-      </w:r>
-      <w:proofErr w:type="spellEnd"/>
-      <w:r>
-        <w:rPr>
-          <w:rFonts w:ascii="Times New Roman" w:hAnsi="Times New Roman" w:cs="Times New Roman"/>
-          <w:b/>
-          <w:sz w:val="26"/>
-          <w:szCs w:val="26"/>
-        </w:rPr>
-        <w:t xml:space="preserve"> </w:t>
-      </w:r>
-      <w:proofErr w:type="spellStart"/>
-      <w:r>
-        <w:rPr>
-          <w:rFonts w:ascii="Times New Roman" w:hAnsi="Times New Roman" w:cs="Times New Roman"/>
-          <w:b/>
-          <w:sz w:val="26"/>
-          <w:szCs w:val="26"/>
-        </w:rPr>
-        <w:t>vụ</w:t>
-      </w:r>
-      <w:proofErr w:type="spellEnd"/>
+        <w:t>Quy trình nghiệp vụ</w:t>
+      </w:r>
     </w:p>
     <w:p>
       <w:pPr>
@@ -1246,27 +841,7 @@
           <w:sz w:val="26"/>
           <w:szCs w:val="26"/>
         </w:rPr>
-        <w:t xml:space="preserve">Quy </w:t>
-      </w:r>
-      <w:proofErr w:type="spellStart"/>
-      <w:r>
-        <w:rPr>
-          <w:rFonts w:ascii="Times New Roman" w:hAnsi="Times New Roman" w:cs="Times New Roman"/>
-          <w:b/>
-          <w:sz w:val="26"/>
-          <w:szCs w:val="26"/>
-        </w:rPr>
-        <w:t>định</w:t>
-      </w:r>
-      <w:proofErr w:type="spellEnd"/>
-      <w:r>
-        <w:rPr>
-          <w:rFonts w:ascii="Times New Roman" w:hAnsi="Times New Roman" w:cs="Times New Roman"/>
-          <w:b/>
-          <w:sz w:val="26"/>
-          <w:szCs w:val="26"/>
-        </w:rPr>
-        <w:t>:</w:t>
+        <w:t>Quy định:</w:t>
       </w:r>
     </w:p>
     <w:p>
@@ -1307,308 +882,44 @@
           <w:sz w:val="26"/>
           <w:szCs w:val="26"/>
         </w:rPr>
-        <w:t xml:space="preserve">Danh </w:t>
-      </w:r>
-      <w:proofErr w:type="spellStart"/>
-      <w:r>
-        <w:rPr>
-          <w:rFonts w:ascii="Times New Roman" w:hAnsi="Times New Roman" w:cs="Times New Roman"/>
-          <w:b/>
-          <w:sz w:val="26"/>
-          <w:szCs w:val="26"/>
-        </w:rPr>
-        <w:t>sách</w:t>
-      </w:r>
-      <w:proofErr w:type="spellEnd"/>
-      <w:r>
-        <w:rPr>
-          <w:rFonts w:ascii="Times New Roman" w:hAnsi="Times New Roman" w:cs="Times New Roman"/>
-          <w:b/>
-          <w:sz w:val="26"/>
-          <w:szCs w:val="26"/>
-        </w:rPr>
-        <w:t xml:space="preserve"> </w:t>
-      </w:r>
-      <w:proofErr w:type="spellStart"/>
-      <w:r>
-        <w:rPr>
-          <w:rFonts w:ascii="Times New Roman" w:hAnsi="Times New Roman" w:cs="Times New Roman"/>
-          <w:b/>
-          <w:sz w:val="26"/>
-          <w:szCs w:val="26"/>
-        </w:rPr>
-        <w:t>các</w:t>
-      </w:r>
-      <w:proofErr w:type="spellEnd"/>
-      <w:r>
-        <w:rPr>
-          <w:rFonts w:ascii="Times New Roman" w:hAnsi="Times New Roman" w:cs="Times New Roman"/>
-          <w:b/>
-          <w:sz w:val="26"/>
-          <w:szCs w:val="26"/>
-        </w:rPr>
-        <w:t xml:space="preserve"> </w:t>
-      </w:r>
-      <w:proofErr w:type="spellStart"/>
-      <w:r>
-        <w:rPr>
-          <w:rFonts w:ascii="Times New Roman" w:hAnsi="Times New Roman" w:cs="Times New Roman"/>
-          <w:b/>
-          <w:sz w:val="26"/>
-          <w:szCs w:val="26"/>
-        </w:rPr>
-        <w:t>c</w:t>
-      </w:r>
-      <w:r>
-        <w:rPr>
-          <w:rFonts w:ascii="Times New Roman" w:hAnsi="Times New Roman" w:cs="Times New Roman"/>
-          <w:b/>
-          <w:sz w:val="26"/>
-          <w:szCs w:val="26"/>
-        </w:rPr>
-        <w:t>âu</w:t>
-      </w:r>
-      <w:proofErr w:type="spellEnd"/>
-      <w:r>
-        <w:rPr>
-          <w:rFonts w:ascii="Times New Roman" w:hAnsi="Times New Roman" w:cs="Times New Roman"/>
-          <w:b/>
-          <w:sz w:val="26"/>
-          <w:szCs w:val="26"/>
-        </w:rPr>
-        <w:t xml:space="preserve"> </w:t>
-      </w:r>
-      <w:proofErr w:type="spellStart"/>
-      <w:r>
-        <w:rPr>
-          <w:rFonts w:ascii="Times New Roman" w:hAnsi="Times New Roman" w:cs="Times New Roman"/>
-          <w:b/>
-          <w:sz w:val="26"/>
-          <w:szCs w:val="26"/>
-        </w:rPr>
-        <w:t>hỏi</w:t>
-      </w:r>
-      <w:proofErr w:type="spellEnd"/>
-      <w:r>
-        <w:rPr>
-          <w:rFonts w:ascii="Times New Roman" w:hAnsi="Times New Roman" w:cs="Times New Roman"/>
-          <w:b/>
-          <w:sz w:val="26"/>
-          <w:szCs w:val="26"/>
-        </w:rPr>
-        <w:t xml:space="preserve"> </w:t>
-      </w:r>
-      <w:proofErr w:type="spellStart"/>
-      <w:r>
-        <w:rPr>
-          <w:rFonts w:ascii="Times New Roman" w:hAnsi="Times New Roman" w:cs="Times New Roman"/>
-          <w:b/>
-          <w:sz w:val="26"/>
-          <w:szCs w:val="26"/>
-        </w:rPr>
-        <w:t>khi</w:t>
-      </w:r>
-      <w:proofErr w:type="spellEnd"/>
-      <w:r>
-        <w:rPr>
-          <w:rFonts w:ascii="Times New Roman" w:hAnsi="Times New Roman" w:cs="Times New Roman"/>
-          <w:b/>
-          <w:sz w:val="26"/>
-          <w:szCs w:val="26"/>
-        </w:rPr>
-        <w:t xml:space="preserve"> </w:t>
-      </w:r>
-      <w:proofErr w:type="spellStart"/>
-      <w:r>
-        <w:rPr>
-          <w:rFonts w:ascii="Times New Roman" w:hAnsi="Times New Roman" w:cs="Times New Roman"/>
-          <w:b/>
-          <w:sz w:val="26"/>
-          <w:szCs w:val="26"/>
-        </w:rPr>
-        <w:t>thu</w:t>
-      </w:r>
-      <w:proofErr w:type="spellEnd"/>
-      <w:r>
-        <w:rPr>
-          <w:rFonts w:ascii="Times New Roman" w:hAnsi="Times New Roman" w:cs="Times New Roman"/>
-          <w:b/>
-          <w:sz w:val="26"/>
-          <w:szCs w:val="26"/>
-        </w:rPr>
-        <w:t xml:space="preserve"> </w:t>
-      </w:r>
-      <w:proofErr w:type="spellStart"/>
-      <w:r>
-        <w:rPr>
-          <w:rFonts w:ascii="Times New Roman" w:hAnsi="Times New Roman" w:cs="Times New Roman"/>
-          <w:b/>
-          <w:sz w:val="26"/>
-          <w:szCs w:val="26"/>
-        </w:rPr>
-        <w:t>thập</w:t>
-      </w:r>
-      <w:proofErr w:type="spellEnd"/>
-      <w:r>
-        <w:rPr>
-          <w:rFonts w:ascii="Times New Roman" w:hAnsi="Times New Roman" w:cs="Times New Roman"/>
-          <w:b/>
-          <w:sz w:val="26"/>
-          <w:szCs w:val="26"/>
-        </w:rPr>
-        <w:t xml:space="preserve"> </w:t>
-      </w:r>
-      <w:proofErr w:type="spellStart"/>
-      <w:r>
-        <w:rPr>
-          <w:rFonts w:ascii="Times New Roman" w:hAnsi="Times New Roman" w:cs="Times New Roman"/>
-          <w:b/>
-          <w:sz w:val="26"/>
-          <w:szCs w:val="26"/>
-        </w:rPr>
-        <w:t>và</w:t>
-      </w:r>
-      <w:proofErr w:type="spellEnd"/>
-      <w:r>
-        <w:rPr>
-          <w:rFonts w:ascii="Times New Roman" w:hAnsi="Times New Roman" w:cs="Times New Roman"/>
-          <w:b/>
-          <w:sz w:val="26"/>
-          <w:szCs w:val="26"/>
-        </w:rPr>
-        <w:t xml:space="preserve"> </w:t>
-      </w:r>
-      <w:proofErr w:type="spellStart"/>
-      <w:r>
-        <w:rPr>
-          <w:rFonts w:ascii="Times New Roman" w:hAnsi="Times New Roman" w:cs="Times New Roman"/>
-          <w:b/>
-          <w:sz w:val="26"/>
-          <w:szCs w:val="26"/>
-        </w:rPr>
-        <w:t>làm</w:t>
-      </w:r>
-      <w:proofErr w:type="spellEnd"/>
-      <w:r>
-        <w:rPr>
-          <w:rFonts w:ascii="Times New Roman" w:hAnsi="Times New Roman" w:cs="Times New Roman"/>
-          <w:b/>
-          <w:sz w:val="26"/>
-          <w:szCs w:val="26"/>
-        </w:rPr>
-        <w:t xml:space="preserve"> </w:t>
-      </w:r>
-      <w:proofErr w:type="spellStart"/>
-      <w:r>
-        <w:rPr>
-          <w:rFonts w:ascii="Times New Roman" w:hAnsi="Times New Roman" w:cs="Times New Roman"/>
-          <w:b/>
-          <w:sz w:val="26"/>
-          <w:szCs w:val="26"/>
-        </w:rPr>
-        <w:t>rõ</w:t>
-      </w:r>
-      <w:proofErr w:type="spellEnd"/>
-      <w:r>
-        <w:rPr>
-          <w:rFonts w:ascii="Times New Roman" w:hAnsi="Times New Roman" w:cs="Times New Roman"/>
-          <w:b/>
-          <w:sz w:val="26"/>
-          <w:szCs w:val="26"/>
-        </w:rPr>
-        <w:t xml:space="preserve"> </w:t>
-      </w:r>
-      <w:proofErr w:type="spellStart"/>
-      <w:r>
-        <w:rPr>
-          <w:rFonts w:ascii="Times New Roman" w:hAnsi="Times New Roman" w:cs="Times New Roman"/>
-          <w:b/>
-          <w:sz w:val="26"/>
-          <w:szCs w:val="26"/>
-        </w:rPr>
-        <w:t>yêu</w:t>
-      </w:r>
-      <w:proofErr w:type="spellEnd"/>
-      <w:r>
-        <w:rPr>
-          <w:rFonts w:ascii="Times New Roman" w:hAnsi="Times New Roman" w:cs="Times New Roman"/>
-          <w:b/>
-          <w:sz w:val="26"/>
-          <w:szCs w:val="26"/>
-        </w:rPr>
-        <w:t xml:space="preserve"> </w:t>
-      </w:r>
-      <w:proofErr w:type="spellStart"/>
-      <w:r>
-        <w:rPr>
-          <w:rFonts w:ascii="Times New Roman" w:hAnsi="Times New Roman" w:cs="Times New Roman"/>
-          <w:b/>
-          <w:sz w:val="26"/>
-          <w:szCs w:val="26"/>
-        </w:rPr>
-        <w:t>cầu</w:t>
-      </w:r>
-      <w:proofErr w:type="spellEnd"/>
-      <w:r>
-        <w:rPr>
-          <w:rFonts w:ascii="Times New Roman" w:hAnsi="Times New Roman" w:cs="Times New Roman"/>
-          <w:b/>
-          <w:sz w:val="26"/>
-          <w:szCs w:val="26"/>
-        </w:rPr>
-        <w:t xml:space="preserve"> </w:t>
-      </w:r>
-      <w:proofErr w:type="spellStart"/>
-      <w:r>
-        <w:rPr>
-          <w:rFonts w:ascii="Times New Roman" w:hAnsi="Times New Roman" w:cs="Times New Roman"/>
-          <w:b/>
-          <w:sz w:val="26"/>
-          <w:szCs w:val="26"/>
-        </w:rPr>
-        <w:t>của</w:t>
-      </w:r>
-      <w:proofErr w:type="spellEnd"/>
-      <w:r>
-        <w:rPr>
-          <w:rFonts w:ascii="Times New Roman" w:hAnsi="Times New Roman" w:cs="Times New Roman"/>
-          <w:b/>
-          <w:sz w:val="26"/>
-          <w:szCs w:val="26"/>
-        </w:rPr>
-        <w:t xml:space="preserve"> </w:t>
-      </w:r>
-      <w:proofErr w:type="spellStart"/>
-      <w:r>
-        <w:rPr>
-          <w:rFonts w:ascii="Times New Roman" w:hAnsi="Times New Roman" w:cs="Times New Roman"/>
-          <w:b/>
-          <w:sz w:val="26"/>
-          <w:szCs w:val="26"/>
-        </w:rPr>
-        <w:t>ứng</w:t>
-      </w:r>
-      <w:proofErr w:type="spellEnd"/>
-      <w:r>
-        <w:rPr>
-          <w:rFonts w:ascii="Times New Roman" w:hAnsi="Times New Roman" w:cs="Times New Roman"/>
-          <w:b/>
-          <w:sz w:val="26"/>
-          <w:szCs w:val="26"/>
-        </w:rPr>
-        <w:t xml:space="preserve"> </w:t>
-      </w:r>
-      <w:proofErr w:type="spellStart"/>
-      <w:r>
-        <w:rPr>
-          <w:rFonts w:ascii="Times New Roman" w:hAnsi="Times New Roman" w:cs="Times New Roman"/>
-          <w:b/>
-          <w:sz w:val="26"/>
-          <w:szCs w:val="26"/>
-        </w:rPr>
-        <w:t>dụng</w:t>
-      </w:r>
-      <w:proofErr w:type="spellEnd"/>
+        <w:t>Danh sách các c</w:t>
+      </w:r>
+      <w:r>
+        <w:rPr>
+          <w:rFonts w:ascii="Times New Roman" w:hAnsi="Times New Roman" w:cs="Times New Roman"/>
+          <w:b/>
+          <w:sz w:val="26"/>
+          <w:szCs w:val="26"/>
+        </w:rPr>
+        <w:t xml:space="preserve">âu hỏi khi thu thập </w:t>
+      </w:r>
+      <w:r>
+        <w:rPr>
+          <w:rFonts w:ascii="Times New Roman" w:hAnsi="Times New Roman" w:cs="Times New Roman"/>
+          <w:b/>
+          <w:sz w:val="26"/>
+          <w:szCs w:val="26"/>
+        </w:rPr>
+        <w:t xml:space="preserve">và làm rõ </w:t>
+      </w:r>
+      <w:r>
+        <w:rPr>
+          <w:rFonts w:ascii="Times New Roman" w:hAnsi="Times New Roman" w:cs="Times New Roman"/>
+          <w:b/>
+          <w:sz w:val="26"/>
+          <w:szCs w:val="26"/>
+        </w:rPr>
+        <w:t>yêu cầu</w:t>
+      </w:r>
+      <w:r>
+        <w:rPr>
+          <w:rFonts w:ascii="Times New Roman" w:hAnsi="Times New Roman" w:cs="Times New Roman"/>
+          <w:b/>
+          <w:sz w:val="26"/>
+          <w:szCs w:val="26"/>
+        </w:rPr>
+        <w:t xml:space="preserve"> của ứng dụng</w:t>
+      </w:r>
     </w:p>
     <w:tbl>
       <w:tblPr>
@@ -1670,7 +981,6 @@
                 <w:szCs w:val="26"/>
               </w:rPr>
             </w:pPr>
-            <w:proofErr w:type="spellStart"/>
             <w:r>
               <w:rPr>
                 <w:rFonts w:ascii="Times New Roman" w:hAnsi="Times New Roman" w:cs="Times New Roman"/>
@@ -1679,10 +989,18 @@
                 <w:sz w:val="26"/>
                 <w:szCs w:val="26"/>
               </w:rPr>
-              <w:t>Câu</w:t>
+              <w:t>Câu hỏi (Questions)</w:t>
             </w:r>
-            <w:proofErr w:type="spellEnd"/>
-            <w:r>
+          </w:p>
+        </w:tc>
+        <w:tc>
+          <w:tcPr>
+            <w:tcW w:w="1836" w:type="pct"/>
+          </w:tcPr>
+          <w:p>
+            <w:pPr>
+              <w:spacing w:after="120"/>
+              <w:jc w:val="center"/>
               <w:rPr>
                 <w:rFonts w:ascii="Times New Roman" w:hAnsi="Times New Roman" w:cs="Times New Roman"/>
                 <w:b/>
@@ -1690,9 +1008,7 @@
                 <w:sz w:val="26"/>
                 <w:szCs w:val="26"/>
               </w:rPr>
-              <w:t xml:space="preserve"> </w:t>
-            </w:r>
-            <w:proofErr w:type="spellStart"/>
+            </w:pPr>
             <w:r>
               <w:rPr>
                 <w:rFonts w:ascii="Times New Roman" w:hAnsi="Times New Roman" w:cs="Times New Roman"/>
@@ -1701,10 +1017,18 @@
                 <w:sz w:val="26"/>
                 <w:szCs w:val="26"/>
               </w:rPr>
-              <w:t>hỏi</w:t>
+              <w:t>Trả lời (Answers)</w:t>
             </w:r>
-            <w:proofErr w:type="spellEnd"/>
-            <w:r>
+          </w:p>
+        </w:tc>
+        <w:tc>
+          <w:tcPr>
+            <w:tcW w:w="1330" w:type="pct"/>
+          </w:tcPr>
+          <w:p>
+            <w:pPr>
+              <w:spacing w:after="120"/>
+              <w:jc w:val="center"/>
               <w:rPr>
                 <w:rFonts w:ascii="Times New Roman" w:hAnsi="Times New Roman" w:cs="Times New Roman"/>
                 <w:b/>
@@ -1712,18 +1036,8 @@
                 <w:sz w:val="26"/>
                 <w:szCs w:val="26"/>
               </w:rPr>
-              <w:t xml:space="preserve"> (Questions)</w:t>
-            </w:r>
-          </w:p>
-        </w:tc>
-        <w:tc>
-          <w:tcPr>
-            <w:tcW w:w="1836" w:type="pct"/>
-          </w:tcPr>
-          <w:p>
-            <w:pPr>
-              <w:spacing w:after="120"/>
-              <w:jc w:val="center"/>
+            </w:pPr>
+            <w:r>
               <w:rPr>
                 <w:rFonts w:ascii="Times New Roman" w:hAnsi="Times New Roman" w:cs="Times New Roman"/>
                 <w:b/>
@@ -1731,103 +1045,8 @@
                 <w:sz w:val="26"/>
                 <w:szCs w:val="26"/>
               </w:rPr>
-            </w:pPr>
-            <w:proofErr w:type="spellStart"/>
-            <w:r>
-              <w:rPr>
-                <w:rFonts w:ascii="Times New Roman" w:hAnsi="Times New Roman" w:cs="Times New Roman"/>
-                <w:b/>
-                <w:i/>
-                <w:sz w:val="26"/>
-                <w:szCs w:val="26"/>
-              </w:rPr>
-              <w:t>Trả</w:t>
+              <w:t>Ghi chú</w:t>
             </w:r>
-            <w:proofErr w:type="spellEnd"/>
-            <w:r>
-              <w:rPr>
-                <w:rFonts w:ascii="Times New Roman" w:hAnsi="Times New Roman" w:cs="Times New Roman"/>
-                <w:b/>
-                <w:i/>
-                <w:sz w:val="26"/>
-                <w:szCs w:val="26"/>
-              </w:rPr>
-              <w:t xml:space="preserve"> </w:t>
-            </w:r>
-            <w:proofErr w:type="spellStart"/>
-            <w:r>
-              <w:rPr>
-                <w:rFonts w:ascii="Times New Roman" w:hAnsi="Times New Roman" w:cs="Times New Roman"/>
-                <w:b/>
-                <w:i/>
-                <w:sz w:val="26"/>
-                <w:szCs w:val="26"/>
-              </w:rPr>
-              <w:t>lời</w:t>
-            </w:r>
-            <w:proofErr w:type="spellEnd"/>
-            <w:r>
-              <w:rPr>
-                <w:rFonts w:ascii="Times New Roman" w:hAnsi="Times New Roman" w:cs="Times New Roman"/>
-                <w:b/>
-                <w:i/>
-                <w:sz w:val="26"/>
-                <w:szCs w:val="26"/>
-              </w:rPr>
-              <w:t xml:space="preserve"> (Answers)</w:t>
-            </w:r>
-          </w:p>
-        </w:tc>
-        <w:tc>
-          <w:tcPr>
-            <w:tcW w:w="1330" w:type="pct"/>
-          </w:tcPr>
-          <w:p>
-            <w:pPr>
-              <w:spacing w:after="120"/>
-              <w:jc w:val="center"/>
-              <w:rPr>
-                <w:rFonts w:ascii="Times New Roman" w:hAnsi="Times New Roman" w:cs="Times New Roman"/>
-                <w:b/>
-                <w:i/>
-                <w:sz w:val="26"/>
-                <w:szCs w:val="26"/>
-              </w:rPr>
-            </w:pPr>
-            <w:proofErr w:type="spellStart"/>
-            <w:r>
-              <w:rPr>
-                <w:rFonts w:ascii="Times New Roman" w:hAnsi="Times New Roman" w:cs="Times New Roman"/>
-                <w:b/>
-                <w:i/>
-                <w:sz w:val="26"/>
-                <w:szCs w:val="26"/>
-              </w:rPr>
-              <w:t>Ghi</w:t>
-            </w:r>
-            <w:proofErr w:type="spellEnd"/>
-            <w:r>
-              <w:rPr>
-                <w:rFonts w:ascii="Times New Roman" w:hAnsi="Times New Roman" w:cs="Times New Roman"/>
-                <w:b/>
-                <w:i/>
-                <w:sz w:val="26"/>
-                <w:szCs w:val="26"/>
-              </w:rPr>
-              <w:t xml:space="preserve"> </w:t>
-            </w:r>
-            <w:proofErr w:type="spellStart"/>
-            <w:r>
-              <w:rPr>
-                <w:rFonts w:ascii="Times New Roman" w:hAnsi="Times New Roman" w:cs="Times New Roman"/>
-                <w:b/>
-                <w:i/>
-                <w:sz w:val="26"/>
-                <w:szCs w:val="26"/>
-              </w:rPr>
-              <w:t>chú</w:t>
-            </w:r>
-            <w:proofErr w:type="spellEnd"/>
           </w:p>
         </w:tc>
       </w:tr>
@@ -2658,35 +1877,14 @@
           <w:szCs w:val="26"/>
         </w:rPr>
       </w:pPr>
-      <w:proofErr w:type="spellStart"/>
-      <w:r>
-        <w:rPr>
-          <w:rFonts w:ascii="Times New Roman" w:hAnsi="Times New Roman" w:cs="Times New Roman"/>
-          <w:b/>
-          <w:sz w:val="26"/>
-          <w:szCs w:val="26"/>
-        </w:rPr>
-        <w:t>Yêu</w:t>
-      </w:r>
-      <w:proofErr w:type="spellEnd"/>
-      <w:r>
-        <w:rPr>
-          <w:rFonts w:ascii="Times New Roman" w:hAnsi="Times New Roman" w:cs="Times New Roman"/>
-          <w:b/>
-          <w:sz w:val="26"/>
-          <w:szCs w:val="26"/>
-        </w:rPr>
-        <w:t xml:space="preserve"> </w:t>
-      </w:r>
-      <w:proofErr w:type="spellStart"/>
-      <w:r>
-        <w:rPr>
-          <w:rFonts w:ascii="Times New Roman" w:hAnsi="Times New Roman" w:cs="Times New Roman"/>
-          <w:b/>
-          <w:sz w:val="26"/>
-          <w:szCs w:val="26"/>
-        </w:rPr>
-        <w:t>cầ</w:t>
+      <w:r>
+        <w:rPr>
+          <w:rFonts w:ascii="Times New Roman" w:hAnsi="Times New Roman" w:cs="Times New Roman"/>
+          <w:b/>
+          <w:sz w:val="26"/>
+          <w:szCs w:val="26"/>
+        </w:rPr>
+        <w:t>Yêu cầ</w:t>
       </w:r>
       <w:r>
         <w:rPr>
@@ -2697,147 +1895,15 @@
         </w:rPr>
         <w:t>u</w:t>
       </w:r>
-      <w:proofErr w:type="spellEnd"/>
-      <w:r>
-        <w:rPr>
-          <w:rFonts w:ascii="Times New Roman" w:hAnsi="Times New Roman" w:cs="Times New Roman"/>
-          <w:b/>
-          <w:sz w:val="26"/>
-          <w:szCs w:val="26"/>
-        </w:rPr>
-        <w:t xml:space="preserve"> </w:t>
-      </w:r>
-      <w:proofErr w:type="spellStart"/>
-      <w:r>
-        <w:rPr>
-          <w:rFonts w:ascii="Times New Roman" w:hAnsi="Times New Roman" w:cs="Times New Roman"/>
-          <w:b/>
-          <w:sz w:val="26"/>
-          <w:szCs w:val="26"/>
-        </w:rPr>
-        <w:t>chức</w:t>
-      </w:r>
-      <w:proofErr w:type="spellEnd"/>
-      <w:r>
-        <w:rPr>
-          <w:rFonts w:ascii="Times New Roman" w:hAnsi="Times New Roman" w:cs="Times New Roman"/>
-          <w:b/>
-          <w:sz w:val="26"/>
-          <w:szCs w:val="26"/>
-        </w:rPr>
-        <w:t xml:space="preserve"> </w:t>
-      </w:r>
-      <w:proofErr w:type="spellStart"/>
-      <w:r>
-        <w:rPr>
-          <w:rFonts w:ascii="Times New Roman" w:hAnsi="Times New Roman" w:cs="Times New Roman"/>
-          <w:b/>
-          <w:sz w:val="26"/>
-          <w:szCs w:val="26"/>
-        </w:rPr>
-        <w:t>năng</w:t>
-      </w:r>
-      <w:proofErr w:type="spellEnd"/>
-      <w:r>
-        <w:rPr>
-          <w:rFonts w:ascii="Times New Roman" w:hAnsi="Times New Roman" w:cs="Times New Roman"/>
-          <w:b/>
-          <w:sz w:val="26"/>
-          <w:szCs w:val="26"/>
-        </w:rPr>
-        <w:t xml:space="preserve">/phi </w:t>
-      </w:r>
-      <w:proofErr w:type="spellStart"/>
-      <w:r>
-        <w:rPr>
-          <w:rFonts w:ascii="Times New Roman" w:hAnsi="Times New Roman" w:cs="Times New Roman"/>
-          <w:b/>
-          <w:sz w:val="26"/>
-          <w:szCs w:val="26"/>
-        </w:rPr>
-        <w:t>chức</w:t>
-      </w:r>
-      <w:proofErr w:type="spellEnd"/>
-      <w:r>
-        <w:rPr>
-          <w:rFonts w:ascii="Times New Roman" w:hAnsi="Times New Roman" w:cs="Times New Roman"/>
-          <w:b/>
-          <w:sz w:val="26"/>
-          <w:szCs w:val="26"/>
-        </w:rPr>
-        <w:t xml:space="preserve"> </w:t>
-      </w:r>
-      <w:proofErr w:type="spellStart"/>
-      <w:r>
-        <w:rPr>
-          <w:rFonts w:ascii="Times New Roman" w:hAnsi="Times New Roman" w:cs="Times New Roman"/>
-          <w:b/>
-          <w:sz w:val="26"/>
-          <w:szCs w:val="26"/>
-        </w:rPr>
-        <w:t>năng</w:t>
-      </w:r>
-      <w:proofErr w:type="spellEnd"/>
-      <w:r>
-        <w:rPr>
-          <w:rFonts w:ascii="Times New Roman" w:hAnsi="Times New Roman" w:cs="Times New Roman"/>
-          <w:b/>
-          <w:sz w:val="26"/>
-          <w:szCs w:val="26"/>
-        </w:rPr>
-        <w:t xml:space="preserve"> </w:t>
-      </w:r>
-      <w:proofErr w:type="spellStart"/>
-      <w:r>
-        <w:rPr>
-          <w:rFonts w:ascii="Times New Roman" w:hAnsi="Times New Roman" w:cs="Times New Roman"/>
-          <w:b/>
-          <w:sz w:val="26"/>
-          <w:szCs w:val="26"/>
-        </w:rPr>
-        <w:t>của</w:t>
-      </w:r>
-      <w:proofErr w:type="spellEnd"/>
-      <w:r>
-        <w:rPr>
-          <w:rFonts w:ascii="Times New Roman" w:hAnsi="Times New Roman" w:cs="Times New Roman"/>
-          <w:b/>
-          <w:sz w:val="26"/>
-          <w:szCs w:val="26"/>
-        </w:rPr>
-        <w:t xml:space="preserve"> </w:t>
-      </w:r>
-      <w:proofErr w:type="spellStart"/>
-      <w:r>
-        <w:rPr>
-          <w:rFonts w:ascii="Times New Roman" w:hAnsi="Times New Roman" w:cs="Times New Roman"/>
-          <w:b/>
-          <w:sz w:val="26"/>
-          <w:szCs w:val="26"/>
-        </w:rPr>
-        <w:t>ứng</w:t>
-      </w:r>
-      <w:proofErr w:type="spellEnd"/>
-      <w:r>
-        <w:rPr>
-          <w:rFonts w:ascii="Times New Roman" w:hAnsi="Times New Roman" w:cs="Times New Roman"/>
-          <w:b/>
-          <w:sz w:val="26"/>
-          <w:szCs w:val="26"/>
-        </w:rPr>
-        <w:t xml:space="preserve"> </w:t>
-      </w:r>
-      <w:proofErr w:type="spellStart"/>
-      <w:r>
-        <w:rPr>
-          <w:rFonts w:ascii="Times New Roman" w:hAnsi="Times New Roman" w:cs="Times New Roman"/>
-          <w:b/>
-          <w:sz w:val="26"/>
-          <w:szCs w:val="26"/>
-        </w:rPr>
-        <w:t>dụng</w:t>
-      </w:r>
-      <w:proofErr w:type="spellEnd"/>
+      <w:r>
+        <w:rPr>
+          <w:rFonts w:ascii="Times New Roman" w:hAnsi="Times New Roman" w:cs="Times New Roman"/>
+          <w:b/>
+          <w:sz w:val="26"/>
+          <w:szCs w:val="26"/>
+        </w:rPr>
+        <w:t xml:space="preserve"> chức năng/phi chức năng của ứng dụng</w:t>
+      </w:r>
     </w:p>
     <w:p>
       <w:pPr>
@@ -2868,7 +1934,6 @@
           <w:szCs w:val="26"/>
         </w:rPr>
       </w:pPr>
-      <w:proofErr w:type="spellStart"/>
       <w:r>
         <w:rPr>
           <w:rFonts w:ascii="Times New Roman" w:hAnsi="Times New Roman" w:cs="Times New Roman"/>
@@ -2877,167 +1942,7 @@
           <w:szCs w:val="26"/>
         </w:rPr>
         <w:lastRenderedPageBreak/>
-        <w:t>Sơ</w:t>
-      </w:r>
-      <w:proofErr w:type="spellEnd"/>
-      <w:r>
-        <w:rPr>
-          <w:rFonts w:ascii="Times New Roman" w:hAnsi="Times New Roman" w:cs="Times New Roman"/>
-          <w:b/>
-          <w:sz w:val="26"/>
-          <w:szCs w:val="26"/>
-        </w:rPr>
-        <w:t xml:space="preserve"> </w:t>
-      </w:r>
-      <w:proofErr w:type="spellStart"/>
-      <w:r>
-        <w:rPr>
-          <w:rFonts w:ascii="Times New Roman" w:hAnsi="Times New Roman" w:cs="Times New Roman"/>
-          <w:b/>
-          <w:sz w:val="26"/>
-          <w:szCs w:val="26"/>
-        </w:rPr>
-        <w:t>đồ</w:t>
-      </w:r>
-      <w:proofErr w:type="spellEnd"/>
-      <w:r>
-        <w:rPr>
-          <w:rFonts w:ascii="Times New Roman" w:hAnsi="Times New Roman" w:cs="Times New Roman"/>
-          <w:b/>
-          <w:sz w:val="26"/>
-          <w:szCs w:val="26"/>
-        </w:rPr>
-        <w:t xml:space="preserve"> </w:t>
-      </w:r>
-      <w:proofErr w:type="spellStart"/>
-      <w:r>
-        <w:rPr>
-          <w:rFonts w:ascii="Times New Roman" w:hAnsi="Times New Roman" w:cs="Times New Roman"/>
-          <w:b/>
-          <w:sz w:val="26"/>
-          <w:szCs w:val="26"/>
-        </w:rPr>
-        <w:t>phân</w:t>
-      </w:r>
-      <w:proofErr w:type="spellEnd"/>
-      <w:r>
-        <w:rPr>
-          <w:rFonts w:ascii="Times New Roman" w:hAnsi="Times New Roman" w:cs="Times New Roman"/>
-          <w:b/>
-          <w:sz w:val="26"/>
-          <w:szCs w:val="26"/>
-        </w:rPr>
-        <w:t xml:space="preserve"> </w:t>
-      </w:r>
-      <w:proofErr w:type="spellStart"/>
-      <w:r>
-        <w:rPr>
-          <w:rFonts w:ascii="Times New Roman" w:hAnsi="Times New Roman" w:cs="Times New Roman"/>
-          <w:b/>
-          <w:sz w:val="26"/>
-          <w:szCs w:val="26"/>
-        </w:rPr>
-        <w:t>cấp</w:t>
-      </w:r>
-      <w:proofErr w:type="spellEnd"/>
-      <w:r>
-        <w:rPr>
-          <w:rFonts w:ascii="Times New Roman" w:hAnsi="Times New Roman" w:cs="Times New Roman"/>
-          <w:b/>
-          <w:sz w:val="26"/>
-          <w:szCs w:val="26"/>
-        </w:rPr>
-        <w:t xml:space="preserve"> </w:t>
-      </w:r>
-      <w:proofErr w:type="spellStart"/>
-      <w:r>
-        <w:rPr>
-          <w:rFonts w:ascii="Times New Roman" w:hAnsi="Times New Roman" w:cs="Times New Roman"/>
-          <w:b/>
-          <w:sz w:val="26"/>
-          <w:szCs w:val="26"/>
-        </w:rPr>
-        <w:t>chức</w:t>
-      </w:r>
-      <w:proofErr w:type="spellEnd"/>
-      <w:r>
-        <w:rPr>
-          <w:rFonts w:ascii="Times New Roman" w:hAnsi="Times New Roman" w:cs="Times New Roman"/>
-          <w:b/>
-          <w:sz w:val="26"/>
-          <w:szCs w:val="26"/>
-        </w:rPr>
-        <w:t xml:space="preserve"> </w:t>
-      </w:r>
-      <w:proofErr w:type="spellStart"/>
-      <w:r>
-        <w:rPr>
-          <w:rFonts w:ascii="Times New Roman" w:hAnsi="Times New Roman" w:cs="Times New Roman"/>
-          <w:b/>
-          <w:sz w:val="26"/>
-          <w:szCs w:val="26"/>
-        </w:rPr>
-        <w:t>năng</w:t>
-      </w:r>
-      <w:proofErr w:type="spellEnd"/>
-      <w:r>
-        <w:rPr>
-          <w:rFonts w:ascii="Times New Roman" w:hAnsi="Times New Roman" w:cs="Times New Roman"/>
-          <w:b/>
-          <w:sz w:val="26"/>
-          <w:szCs w:val="26"/>
-        </w:rPr>
-        <w:t xml:space="preserve"> </w:t>
-      </w:r>
-      <w:proofErr w:type="spellStart"/>
-      <w:r>
-        <w:rPr>
-          <w:rFonts w:ascii="Times New Roman" w:hAnsi="Times New Roman" w:cs="Times New Roman"/>
-          <w:b/>
-          <w:sz w:val="26"/>
-          <w:szCs w:val="26"/>
-        </w:rPr>
-        <w:t>của</w:t>
-      </w:r>
-      <w:proofErr w:type="spellEnd"/>
-      <w:r>
-        <w:rPr>
-          <w:rFonts w:ascii="Times New Roman" w:hAnsi="Times New Roman" w:cs="Times New Roman"/>
-          <w:b/>
-          <w:sz w:val="26"/>
-          <w:szCs w:val="26"/>
-        </w:rPr>
-        <w:t xml:space="preserve"> </w:t>
-      </w:r>
-      <w:proofErr w:type="spellStart"/>
-      <w:r>
-        <w:rPr>
-          <w:rFonts w:ascii="Times New Roman" w:hAnsi="Times New Roman" w:cs="Times New Roman"/>
-          <w:b/>
-          <w:sz w:val="26"/>
-          <w:szCs w:val="26"/>
-        </w:rPr>
-        <w:t>ứng</w:t>
-      </w:r>
-      <w:proofErr w:type="spellEnd"/>
-      <w:r>
-        <w:rPr>
-          <w:rFonts w:ascii="Times New Roman" w:hAnsi="Times New Roman" w:cs="Times New Roman"/>
-          <w:b/>
-          <w:sz w:val="26"/>
-          <w:szCs w:val="26"/>
-        </w:rPr>
-        <w:t xml:space="preserve"> </w:t>
-      </w:r>
-      <w:proofErr w:type="spellStart"/>
-      <w:r>
-        <w:rPr>
-          <w:rFonts w:ascii="Times New Roman" w:hAnsi="Times New Roman" w:cs="Times New Roman"/>
-          <w:b/>
-          <w:sz w:val="26"/>
-          <w:szCs w:val="26"/>
-        </w:rPr>
-        <w:t>dụn</w:t>
+        <w:t>Sơ đồ phân cấp chức năng của ứng dụn</w:t>
       </w:r>
       <w:r>
         <w:rPr>
@@ -3048,7 +1953,6 @@
         </w:rPr>
         <w:t>g</w:t>
       </w:r>
-      <w:proofErr w:type="spellEnd"/>
     </w:p>
     <w:p>
       <w:pPr>
@@ -3086,183 +1990,7 @@
           <w:b/>
           <w:sz w:val="26"/>
         </w:rPr>
-        <w:t xml:space="preserve">Các </w:t>
-      </w:r>
-      <w:proofErr w:type="spellStart"/>
-      <w:r>
-        <w:rPr>
-          <w:b/>
-          <w:sz w:val="26"/>
-        </w:rPr>
-        <w:t>chức</w:t>
-      </w:r>
-      <w:proofErr w:type="spellEnd"/>
-      <w:r>
-        <w:rPr>
-          <w:b/>
-          <w:sz w:val="26"/>
-        </w:rPr>
-        <w:t xml:space="preserve"> </w:t>
-      </w:r>
-      <w:proofErr w:type="spellStart"/>
-      <w:r>
-        <w:rPr>
-          <w:b/>
-          <w:sz w:val="26"/>
-        </w:rPr>
-        <w:t>năng</w:t>
-      </w:r>
-      <w:proofErr w:type="spellEnd"/>
-      <w:r>
-        <w:rPr>
-          <w:b/>
-          <w:sz w:val="26"/>
-        </w:rPr>
-        <w:t xml:space="preserve"> </w:t>
-      </w:r>
-      <w:proofErr w:type="spellStart"/>
-      <w:r>
-        <w:rPr>
-          <w:b/>
-          <w:sz w:val="26"/>
-        </w:rPr>
-        <w:t>chính</w:t>
-      </w:r>
-      <w:proofErr w:type="spellEnd"/>
-      <w:r>
-        <w:rPr>
-          <w:b/>
-          <w:sz w:val="26"/>
-        </w:rPr>
-        <w:t xml:space="preserve"> </w:t>
-      </w:r>
-      <w:proofErr w:type="spellStart"/>
-      <w:r>
-        <w:rPr>
-          <w:b/>
-          <w:sz w:val="26"/>
-        </w:rPr>
-        <w:t>cho</w:t>
-      </w:r>
-      <w:proofErr w:type="spellEnd"/>
-      <w:r>
-        <w:rPr>
-          <w:b/>
-          <w:sz w:val="26"/>
-        </w:rPr>
-        <w:t xml:space="preserve"> </w:t>
-      </w:r>
-      <w:proofErr w:type="spellStart"/>
-      <w:r>
-        <w:rPr>
-          <w:b/>
-          <w:sz w:val="26"/>
-        </w:rPr>
-        <w:t>ứng</w:t>
-      </w:r>
-      <w:proofErr w:type="spellEnd"/>
-      <w:r>
-        <w:rPr>
-          <w:b/>
-          <w:sz w:val="26"/>
-        </w:rPr>
-        <w:t xml:space="preserve"> </w:t>
-      </w:r>
-      <w:proofErr w:type="spellStart"/>
-      <w:r>
-        <w:rPr>
-          <w:b/>
-          <w:sz w:val="26"/>
-        </w:rPr>
-        <w:t>dụng</w:t>
-      </w:r>
-      <w:proofErr w:type="spellEnd"/>
-      <w:r>
-        <w:rPr>
-          <w:b/>
-          <w:sz w:val="26"/>
-        </w:rPr>
-        <w:t xml:space="preserve"> (</w:t>
-      </w:r>
-      <w:proofErr w:type="spellStart"/>
-      <w:r>
-        <w:rPr>
-          <w:b/>
-          <w:sz w:val="26"/>
-        </w:rPr>
-        <w:t>Mục</w:t>
-      </w:r>
-      <w:proofErr w:type="spellEnd"/>
-      <w:r>
-        <w:rPr>
-          <w:b/>
-          <w:sz w:val="26"/>
-        </w:rPr>
-        <w:t xml:space="preserve"> </w:t>
-      </w:r>
-      <w:proofErr w:type="spellStart"/>
-      <w:r>
-        <w:rPr>
-          <w:b/>
-          <w:sz w:val="26"/>
-        </w:rPr>
-        <w:t>tiêu</w:t>
-      </w:r>
-      <w:proofErr w:type="spellEnd"/>
-      <w:r>
-        <w:rPr>
-          <w:b/>
-          <w:sz w:val="26"/>
-        </w:rPr>
-        <w:t xml:space="preserve"> </w:t>
-      </w:r>
-      <w:proofErr w:type="spellStart"/>
-      <w:r>
-        <w:rPr>
-          <w:b/>
-          <w:sz w:val="26"/>
-        </w:rPr>
-        <w:t>của</w:t>
-      </w:r>
-      <w:proofErr w:type="spellEnd"/>
-      <w:r>
-        <w:rPr>
-          <w:b/>
-          <w:sz w:val="26"/>
-        </w:rPr>
-        <w:t xml:space="preserve"> </w:t>
-      </w:r>
-      <w:proofErr w:type="spellStart"/>
-      <w:r>
-        <w:rPr>
-          <w:b/>
-          <w:sz w:val="26"/>
-        </w:rPr>
-        <w:t>ứng</w:t>
-      </w:r>
-      <w:proofErr w:type="spellEnd"/>
-      <w:r>
-        <w:rPr>
-          <w:b/>
-          <w:sz w:val="26"/>
-        </w:rPr>
-        <w:t xml:space="preserve"> </w:t>
-      </w:r>
-      <w:proofErr w:type="spellStart"/>
-      <w:r>
-        <w:rPr>
-          <w:b/>
-          <w:sz w:val="26"/>
-        </w:rPr>
-        <w:t>dụng</w:t>
-      </w:r>
-      <w:proofErr w:type="spellEnd"/>
-      <w:r>
-        <w:rPr>
-          <w:b/>
-          <w:sz w:val="26"/>
-        </w:rPr>
-        <w:t>)</w:t>
+        <w:t>Các chức năng chính cho ứng dụng (Mục tiêu của ứng dụng)</w:t>
       </w:r>
     </w:p>
     <w:p>
@@ -3291,48 +2019,8 @@
           <w:sz w:val="26"/>
           <w:szCs w:val="26"/>
         </w:rPr>
-        <w:t xml:space="preserve">Link </w:t>
-      </w:r>
-      <w:proofErr w:type="spellStart"/>
-      <w:r>
-        <w:rPr>
-          <w:rFonts w:ascii="Times New Roman" w:hAnsi="Times New Roman" w:cs="Times New Roman"/>
-          <w:b/>
-          <w:i/>
-          <w:iCs/>
-          <w:color w:val="FF0000"/>
-          <w:sz w:val="26"/>
-          <w:szCs w:val="26"/>
-        </w:rPr>
-        <w:t>nhật</w:t>
-      </w:r>
-      <w:proofErr w:type="spellEnd"/>
-      <w:r>
-        <w:rPr>
-          <w:rFonts w:ascii="Times New Roman" w:hAnsi="Times New Roman" w:cs="Times New Roman"/>
-          <w:b/>
-          <w:i/>
-          <w:iCs/>
-          <w:color w:val="FF0000"/>
-          <w:sz w:val="26"/>
-          <w:szCs w:val="26"/>
-        </w:rPr>
-        <w:t xml:space="preserve"> </w:t>
-      </w:r>
-      <w:proofErr w:type="spellStart"/>
-      <w:r>
-        <w:rPr>
-          <w:rFonts w:ascii="Times New Roman" w:hAnsi="Times New Roman" w:cs="Times New Roman"/>
-          <w:b/>
-          <w:i/>
-          <w:iCs/>
-          <w:color w:val="FF0000"/>
-          <w:sz w:val="26"/>
-          <w:szCs w:val="26"/>
-        </w:rPr>
-        <w:t>ký</w:t>
-      </w:r>
-      <w:proofErr w:type="spellEnd"/>
+        <w:t>Link nhật ký</w:t>
+      </w:r>
     </w:p>
     <w:p>
       <w:pPr>
@@ -4784,6 +3472,7 @@
   <w:style w:type="character" w:default="1" w:styleId="DefaultParagraphFont">
     <w:name w:val="Default Paragraph Font"/>
     <w:uiPriority w:val="1"/>
+    <w:semiHidden/>
     <w:unhideWhenUsed/>
   </w:style>
   <w:style w:type="table" w:default="1" w:styleId="TableNormal">

</xml_diff>